<commit_message>
docs: include screenshots in final report
</commit_message>
<xml_diff>
--- a/docs/Mahosample-final-project-report.docx
+++ b/docs/Mahosample-final-project-report.docx
@@ -27397,6 +27397,617 @@
           <w:rFonts w:ascii="Aptos" w:hAnsi="Aptos" w:eastAsia="Aptos"/>
         </w:rPr>
         <w:t xml:space="preserve"> หลังกรอก tracking</w:t>
+      </w:r>
+    </w:p>
+    <w:p>
+      <w:pPr>
+        <w:sectPr>
+          <w:pgSz w:w="12240" w:h="15840"/>
+          <w:pgMar w:top="1440" w:right="1440" w:bottom="1440" w:left="1440" w:header="708" w:footer="708" w:gutter="0"/>
+          <w:cols w:space="720"/>
+          <w:docGrid w:linePitch="360"/>
+        </w:sectPr>
+      </w:pPr>
+    </w:p>
+    <w:p>
+      <w:pPr>
+        <w:pStyle w:val="Heading1"/>
+      </w:pPr>
+      <w:r>
+        <w:t>ภาคผนวก J: Screen Capture Evidence</w:t>
+      </w:r>
+    </w:p>
+    <w:p>
+      <w:r>
+        <w:rPr>
+          <w:rFonts w:ascii="Aptos" w:hAnsi="Aptos" w:eastAsia="Aptos"/>
+        </w:rPr>
+        <w:t>ภาพหน้าจอชุดนี้จับจาก production URL เพื่อใช้เป็นหลักฐานประกอบการทดสอบ flow หลักของระบบ</w:t>
+      </w:r>
+    </w:p>
+    <w:p>
+      <w:pPr>
+        <w:pStyle w:val="Heading2"/>
+        <w:keepNext/>
+      </w:pPr>
+      <w:r>
+        <w:t>ภาพที่ 1: หน้าแบบฟอร์มลงทะเบียนรับตัวอย่าง มะโฮ</w:t>
+      </w:r>
+    </w:p>
+    <w:p>
+      <w:r>
+        <w:drawing>
+          <wp:inline xmlns:a="http://schemas.openxmlformats.org/drawingml/2006/main" xmlns:pic="http://schemas.openxmlformats.org/drawingml/2006/picture">
+            <wp:extent cx="5852160" cy="3840480"/>
+            <wp:docPr id="1" name="Picture 1"/>
+            <wp:cNvGraphicFramePr>
+              <a:graphicFrameLocks noChangeAspect="1"/>
+            </wp:cNvGraphicFramePr>
+            <a:graphic>
+              <a:graphicData uri="http://schemas.openxmlformats.org/drawingml/2006/picture">
+                <pic:pic>
+                  <pic:nvPicPr>
+                    <pic:cNvPr id="0" name="20260902154721-public-registration-form.png"/>
+                    <pic:cNvPicPr/>
+                  </pic:nvPicPr>
+                  <pic:blipFill>
+                    <a:blip r:embed="rId10"/>
+                    <a:stretch>
+                      <a:fillRect/>
+                    </a:stretch>
+                  </pic:blipFill>
+                  <pic:spPr>
+                    <a:xfrm>
+                      <a:off x="0" y="0"/>
+                      <a:ext cx="5852160" cy="3840480"/>
+                    </a:xfrm>
+                    <a:prstGeom prst="rect"/>
+                  </pic:spPr>
+                </pic:pic>
+              </a:graphicData>
+            </a:graphic>
+          </wp:inline>
+        </w:drawing>
+      </w:r>
+    </w:p>
+    <w:p>
+      <w:pPr>
+        <w:pStyle w:val="Heading2"/>
+        <w:keepNext/>
+      </w:pPr>
+      <w:r>
+        <w:t>ภาพที่ 2: Validation เมื่อไม่กรอกช่องทางติดต่อ</w:t>
+      </w:r>
+    </w:p>
+    <w:p>
+      <w:r>
+        <w:drawing>
+          <wp:inline xmlns:a="http://schemas.openxmlformats.org/drawingml/2006/main" xmlns:pic="http://schemas.openxmlformats.org/drawingml/2006/picture">
+            <wp:extent cx="5852160" cy="3840480"/>
+            <wp:docPr id="2" name="Picture 2"/>
+            <wp:cNvGraphicFramePr>
+              <a:graphicFrameLocks noChangeAspect="1"/>
+            </wp:cNvGraphicFramePr>
+            <a:graphic>
+              <a:graphicData uri="http://schemas.openxmlformats.org/drawingml/2006/picture">
+                <pic:pic>
+                  <pic:nvPicPr>
+                    <pic:cNvPr id="0" name="20260902154721-public-contact-validation.png"/>
+                    <pic:cNvPicPr/>
+                  </pic:nvPicPr>
+                  <pic:blipFill>
+                    <a:blip r:embed="rId11"/>
+                    <a:stretch>
+                      <a:fillRect/>
+                    </a:stretch>
+                  </pic:blipFill>
+                  <pic:spPr>
+                    <a:xfrm>
+                      <a:off x="0" y="0"/>
+                      <a:ext cx="5852160" cy="3840480"/>
+                    </a:xfrm>
+                    <a:prstGeom prst="rect"/>
+                  </pic:spPr>
+                </pic:pic>
+              </a:graphicData>
+            </a:graphic>
+          </wp:inline>
+        </w:drawing>
+      </w:r>
+    </w:p>
+    <w:p>
+      <w:pPr>
+        <w:pStyle w:val="Heading2"/>
+        <w:keepNext/>
+      </w:pPr>
+      <w:r>
+        <w:t>ภาพที่ 3: Success card หลังส่งฟอร์ม พร้อมเลขรายการภายใน</w:t>
+      </w:r>
+    </w:p>
+    <w:p>
+      <w:r>
+        <w:drawing>
+          <wp:inline xmlns:a="http://schemas.openxmlformats.org/drawingml/2006/main" xmlns:pic="http://schemas.openxmlformats.org/drawingml/2006/picture">
+            <wp:extent cx="5852160" cy="3840480"/>
+            <wp:docPr id="3" name="Picture 3"/>
+            <wp:cNvGraphicFramePr>
+              <a:graphicFrameLocks noChangeAspect="1"/>
+            </wp:cNvGraphicFramePr>
+            <a:graphic>
+              <a:graphicData uri="http://schemas.openxmlformats.org/drawingml/2006/picture">
+                <pic:pic>
+                  <pic:nvPicPr>
+                    <pic:cNvPr id="0" name="20260902154721-public-success-card.png"/>
+                    <pic:cNvPicPr/>
+                  </pic:nvPicPr>
+                  <pic:blipFill>
+                    <a:blip r:embed="rId12"/>
+                    <a:stretch>
+                      <a:fillRect/>
+                    </a:stretch>
+                  </pic:blipFill>
+                  <pic:spPr>
+                    <a:xfrm>
+                      <a:off x="0" y="0"/>
+                      <a:ext cx="5852160" cy="3840480"/>
+                    </a:xfrm>
+                    <a:prstGeom prst="rect"/>
+                  </pic:spPr>
+                </pic:pic>
+              </a:graphicData>
+            </a:graphic>
+          </wp:inline>
+        </w:drawing>
+      </w:r>
+    </w:p>
+    <w:p>
+      <w:pPr>
+        <w:pStyle w:val="Heading2"/>
+        <w:keepNext/>
+      </w:pPr>
+      <w:r>
+        <w:t>ภาพที่ 4: หน้าเช็คสถานะพบเลข tracking และ Tracking URL</w:t>
+      </w:r>
+    </w:p>
+    <w:p>
+      <w:r>
+        <w:drawing>
+          <wp:inline xmlns:a="http://schemas.openxmlformats.org/drawingml/2006/main" xmlns:pic="http://schemas.openxmlformats.org/drawingml/2006/picture">
+            <wp:extent cx="5852160" cy="3840480"/>
+            <wp:docPr id="4" name="Picture 4"/>
+            <wp:cNvGraphicFramePr>
+              <a:graphicFrameLocks noChangeAspect="1"/>
+            </wp:cNvGraphicFramePr>
+            <a:graphic>
+              <a:graphicData uri="http://schemas.openxmlformats.org/drawingml/2006/picture">
+                <pic:pic>
+                  <pic:nvPicPr>
+                    <pic:cNvPr id="0" name="20260902154721-tracking-found.png"/>
+                    <pic:cNvPicPr/>
+                  </pic:nvPicPr>
+                  <pic:blipFill>
+                    <a:blip r:embed="rId13"/>
+                    <a:stretch>
+                      <a:fillRect/>
+                    </a:stretch>
+                  </pic:blipFill>
+                  <pic:spPr>
+                    <a:xfrm>
+                      <a:off x="0" y="0"/>
+                      <a:ext cx="5852160" cy="3840480"/>
+                    </a:xfrm>
+                    <a:prstGeom prst="rect"/>
+                  </pic:spPr>
+                </pic:pic>
+              </a:graphicData>
+            </a:graphic>
+          </wp:inline>
+        </w:drawing>
+      </w:r>
+    </w:p>
+    <w:p>
+      <w:pPr>
+        <w:pStyle w:val="Heading2"/>
+        <w:keepNext/>
+      </w:pPr>
+      <w:r>
+        <w:t>ภาพที่ 5: หน้าเช็คสถานะเมื่อไม่พบเลข tracking</w:t>
+      </w:r>
+    </w:p>
+    <w:p>
+      <w:r>
+        <w:drawing>
+          <wp:inline xmlns:a="http://schemas.openxmlformats.org/drawingml/2006/main" xmlns:pic="http://schemas.openxmlformats.org/drawingml/2006/picture">
+            <wp:extent cx="5852160" cy="3840480"/>
+            <wp:docPr id="5" name="Picture 5"/>
+            <wp:cNvGraphicFramePr>
+              <a:graphicFrameLocks noChangeAspect="1"/>
+            </wp:cNvGraphicFramePr>
+            <a:graphic>
+              <a:graphicData uri="http://schemas.openxmlformats.org/drawingml/2006/picture">
+                <pic:pic>
+                  <pic:nvPicPr>
+                    <pic:cNvPr id="0" name="20260902154721-tracking-not-found.png"/>
+                    <pic:cNvPicPr/>
+                  </pic:nvPicPr>
+                  <pic:blipFill>
+                    <a:blip r:embed="rId14"/>
+                    <a:stretch>
+                      <a:fillRect/>
+                    </a:stretch>
+                  </pic:blipFill>
+                  <pic:spPr>
+                    <a:xfrm>
+                      <a:off x="0" y="0"/>
+                      <a:ext cx="5852160" cy="3840480"/>
+                    </a:xfrm>
+                    <a:prstGeom prst="rect"/>
+                  </pic:spPr>
+                </pic:pic>
+              </a:graphicData>
+            </a:graphic>
+          </wp:inline>
+        </w:drawing>
+      </w:r>
+    </w:p>
+    <w:p>
+      <w:pPr>
+        <w:pStyle w:val="Heading2"/>
+        <w:keepNext/>
+      </w:pPr>
+      <w:r>
+        <w:t>ภาพที่ 6: Dashboard พนักงานหลัง login</w:t>
+      </w:r>
+    </w:p>
+    <w:p>
+      <w:r>
+        <w:drawing>
+          <wp:inline xmlns:a="http://schemas.openxmlformats.org/drawingml/2006/main" xmlns:pic="http://schemas.openxmlformats.org/drawingml/2006/picture">
+            <wp:extent cx="5852160" cy="3840480"/>
+            <wp:docPr id="6" name="Picture 6"/>
+            <wp:cNvGraphicFramePr>
+              <a:graphicFrameLocks noChangeAspect="1"/>
+            </wp:cNvGraphicFramePr>
+            <a:graphic>
+              <a:graphicData uri="http://schemas.openxmlformats.org/drawingml/2006/picture">
+                <pic:pic>
+                  <pic:nvPicPr>
+                    <pic:cNvPr id="0" name="20260902154721-staff-dashboard.png"/>
+                    <pic:cNvPicPr/>
+                  </pic:nvPicPr>
+                  <pic:blipFill>
+                    <a:blip r:embed="rId15"/>
+                    <a:stretch>
+                      <a:fillRect/>
+                    </a:stretch>
+                  </pic:blipFill>
+                  <pic:spPr>
+                    <a:xfrm>
+                      <a:off x="0" y="0"/>
+                      <a:ext cx="5852160" cy="3840480"/>
+                    </a:xfrm>
+                    <a:prstGeom prst="rect"/>
+                  </pic:spPr>
+                </pic:pic>
+              </a:graphicData>
+            </a:graphic>
+          </wp:inline>
+        </w:drawing>
+      </w:r>
+    </w:p>
+    <w:p>
+      <w:pPr>
+        <w:pStyle w:val="Heading2"/>
+        <w:keepNext/>
+      </w:pPr>
+      <w:r>
+        <w:t>ภาพที่ 7: หน้าตารางข้อมูลเต็ม แสดง column ข้อมูลทั้งหมด</w:t>
+      </w:r>
+    </w:p>
+    <w:p>
+      <w:r>
+        <w:drawing>
+          <wp:inline xmlns:a="http://schemas.openxmlformats.org/drawingml/2006/main" xmlns:pic="http://schemas.openxmlformats.org/drawingml/2006/picture">
+            <wp:extent cx="5852160" cy="3840480"/>
+            <wp:docPr id="7" name="Picture 7"/>
+            <wp:cNvGraphicFramePr>
+              <a:graphicFrameLocks noChangeAspect="1"/>
+            </wp:cNvGraphicFramePr>
+            <a:graphic>
+              <a:graphicData uri="http://schemas.openxmlformats.org/drawingml/2006/picture">
+                <pic:pic>
+                  <pic:nvPicPr>
+                    <pic:cNvPr id="0" name="20260902154721-staff-full-table.png"/>
+                    <pic:cNvPicPr/>
+                  </pic:nvPicPr>
+                  <pic:blipFill>
+                    <a:blip r:embed="rId16"/>
+                    <a:stretch>
+                      <a:fillRect/>
+                    </a:stretch>
+                  </pic:blipFill>
+                  <pic:spPr>
+                    <a:xfrm>
+                      <a:off x="0" y="0"/>
+                      <a:ext cx="5852160" cy="3840480"/>
+                    </a:xfrm>
+                    <a:prstGeom prst="rect"/>
+                  </pic:spPr>
+                </pic:pic>
+              </a:graphicData>
+            </a:graphic>
+          </wp:inline>
+        </w:drawing>
+      </w:r>
+    </w:p>
+    <w:p>
+      <w:pPr>
+        <w:pStyle w:val="Heading2"/>
+        <w:keepNext/>
+      </w:pPr>
+      <w:r>
+        <w:t>ภาพที่ 8: Filter header ตารางด้วยจังหวัด</w:t>
+      </w:r>
+    </w:p>
+    <w:p>
+      <w:r>
+        <w:drawing>
+          <wp:inline xmlns:a="http://schemas.openxmlformats.org/drawingml/2006/main" xmlns:pic="http://schemas.openxmlformats.org/drawingml/2006/picture">
+            <wp:extent cx="5852160" cy="3840480"/>
+            <wp:docPr id="8" name="Picture 8"/>
+            <wp:cNvGraphicFramePr>
+              <a:graphicFrameLocks noChangeAspect="1"/>
+            </wp:cNvGraphicFramePr>
+            <a:graphic>
+              <a:graphicData uri="http://schemas.openxmlformats.org/drawingml/2006/picture">
+                <pic:pic>
+                  <pic:nvPicPr>
+                    <pic:cNvPr id="0" name="20260902154721-staff-filter-province.png"/>
+                    <pic:cNvPicPr/>
+                  </pic:nvPicPr>
+                  <pic:blipFill>
+                    <a:blip r:embed="rId17"/>
+                    <a:stretch>
+                      <a:fillRect/>
+                    </a:stretch>
+                  </pic:blipFill>
+                  <pic:spPr>
+                    <a:xfrm>
+                      <a:off x="0" y="0"/>
+                      <a:ext cx="5852160" cy="3840480"/>
+                    </a:xfrm>
+                    <a:prstGeom prst="rect"/>
+                  </pic:spPr>
+                </pic:pic>
+              </a:graphicData>
+            </a:graphic>
+          </wp:inline>
+        </w:drawing>
+      </w:r>
+    </w:p>
+    <w:p>
+      <w:pPr>
+        <w:pStyle w:val="Heading2"/>
+        <w:keepNext/>
+      </w:pPr>
+      <w:r>
+        <w:t>ภาพที่ 9: Filter วันที่ส่งและวันที่ลงทะเบียนแบบช่วงเวลา</w:t>
+      </w:r>
+    </w:p>
+    <w:p>
+      <w:r>
+        <w:drawing>
+          <wp:inline xmlns:a="http://schemas.openxmlformats.org/drawingml/2006/main" xmlns:pic="http://schemas.openxmlformats.org/drawingml/2006/picture">
+            <wp:extent cx="5852160" cy="3840480"/>
+            <wp:docPr id="9" name="Picture 9"/>
+            <wp:cNvGraphicFramePr>
+              <a:graphicFrameLocks noChangeAspect="1"/>
+            </wp:cNvGraphicFramePr>
+            <a:graphic>
+              <a:graphicData uri="http://schemas.openxmlformats.org/drawingml/2006/picture">
+                <pic:pic>
+                  <pic:nvPicPr>
+                    <pic:cNvPr id="0" name="20260902154721-staff-date-range-filter.png"/>
+                    <pic:cNvPicPr/>
+                  </pic:nvPicPr>
+                  <pic:blipFill>
+                    <a:blip r:embed="rId18"/>
+                    <a:stretch>
+                      <a:fillRect/>
+                    </a:stretch>
+                  </pic:blipFill>
+                  <pic:spPr>
+                    <a:xfrm>
+                      <a:off x="0" y="0"/>
+                      <a:ext cx="5852160" cy="3840480"/>
+                    </a:xfrm>
+                    <a:prstGeom prst="rect"/>
+                  </pic:spPr>
+                </pic:pic>
+              </a:graphicData>
+            </a:graphic>
+          </wp:inline>
+        </w:drawing>
+      </w:r>
+    </w:p>
+    <w:p>
+      <w:pPr>
+        <w:pStyle w:val="Heading2"/>
+        <w:keepNext/>
+      </w:pPr>
+      <w:r>
+        <w:t>ภาพที่ 10: Sorting จาก header ตาราง</w:t>
+      </w:r>
+    </w:p>
+    <w:p>
+      <w:r>
+        <w:drawing>
+          <wp:inline xmlns:a="http://schemas.openxmlformats.org/drawingml/2006/main" xmlns:pic="http://schemas.openxmlformats.org/drawingml/2006/picture">
+            <wp:extent cx="5852160" cy="3840480"/>
+            <wp:docPr id="10" name="Picture 10"/>
+            <wp:cNvGraphicFramePr>
+              <a:graphicFrameLocks noChangeAspect="1"/>
+            </wp:cNvGraphicFramePr>
+            <a:graphic>
+              <a:graphicData uri="http://schemas.openxmlformats.org/drawingml/2006/picture">
+                <pic:pic>
+                  <pic:nvPicPr>
+                    <pic:cNvPr id="0" name="20260902154721-staff-sorting.png"/>
+                    <pic:cNvPicPr/>
+                  </pic:nvPicPr>
+                  <pic:blipFill>
+                    <a:blip r:embed="rId19"/>
+                    <a:stretch>
+                      <a:fillRect/>
+                    </a:stretch>
+                  </pic:blipFill>
+                  <pic:spPr>
+                    <a:xfrm>
+                      <a:off x="0" y="0"/>
+                      <a:ext cx="5852160" cy="3840480"/>
+                    </a:xfrm>
+                    <a:prstGeom prst="rect"/>
+                  </pic:spPr>
+                </pic:pic>
+              </a:graphicData>
+            </a:graphic>
+          </wp:inline>
+        </w:drawing>
+      </w:r>
+    </w:p>
+    <w:p>
+      <w:pPr>
+        <w:pStyle w:val="Heading2"/>
+        <w:keepNext/>
+      </w:pPr>
+      <w:r>
+        <w:t>ภาพที่ 11: Drawer รายละเอียด พร้อมบันทึกคำขอและอัปเดตขนส่ง</w:t>
+      </w:r>
+    </w:p>
+    <w:p>
+      <w:r>
+        <w:drawing>
+          <wp:inline xmlns:a="http://schemas.openxmlformats.org/drawingml/2006/main" xmlns:pic="http://schemas.openxmlformats.org/drawingml/2006/picture">
+            <wp:extent cx="5852160" cy="3840480"/>
+            <wp:docPr id="11" name="Picture 11"/>
+            <wp:cNvGraphicFramePr>
+              <a:graphicFrameLocks noChangeAspect="1"/>
+            </wp:cNvGraphicFramePr>
+            <a:graphic>
+              <a:graphicData uri="http://schemas.openxmlformats.org/drawingml/2006/picture">
+                <pic:pic>
+                  <pic:nvPicPr>
+                    <pic:cNvPr id="0" name="20260902154721-staff-detail-drawer.png"/>
+                    <pic:cNvPicPr/>
+                  </pic:nvPicPr>
+                  <pic:blipFill>
+                    <a:blip r:embed="rId20"/>
+                    <a:stretch>
+                      <a:fillRect/>
+                    </a:stretch>
+                  </pic:blipFill>
+                  <pic:spPr>
+                    <a:xfrm>
+                      <a:off x="0" y="0"/>
+                      <a:ext cx="5852160" cy="3840480"/>
+                    </a:xfrm>
+                    <a:prstGeom prst="rect"/>
+                  </pic:spPr>
+                </pic:pic>
+              </a:graphicData>
+            </a:graphic>
+          </wp:inline>
+        </w:drawing>
+      </w:r>
+    </w:p>
+    <w:p>
+      <w:pPr>
+        <w:pStyle w:val="Heading2"/>
+        <w:keepNext/>
+      </w:pPr>
+      <w:r>
+        <w:t>ภาพที่ 12: Tracking URL แสดงเป็น link คลิกได้</w:t>
+      </w:r>
+    </w:p>
+    <w:p>
+      <w:r>
+        <w:drawing>
+          <wp:inline xmlns:a="http://schemas.openxmlformats.org/drawingml/2006/main" xmlns:pic="http://schemas.openxmlformats.org/drawingml/2006/picture">
+            <wp:extent cx="5852160" cy="3840480"/>
+            <wp:docPr id="12" name="Picture 12"/>
+            <wp:cNvGraphicFramePr>
+              <a:graphicFrameLocks noChangeAspect="1"/>
+            </wp:cNvGraphicFramePr>
+            <a:graphic>
+              <a:graphicData uri="http://schemas.openxmlformats.org/drawingml/2006/picture">
+                <pic:pic>
+                  <pic:nvPicPr>
+                    <pic:cNvPr id="0" name="20260902154721-staff-tracking-url-link.png"/>
+                    <pic:cNvPicPr/>
+                  </pic:nvPicPr>
+                  <pic:blipFill>
+                    <a:blip r:embed="rId21"/>
+                    <a:stretch>
+                      <a:fillRect/>
+                    </a:stretch>
+                  </pic:blipFill>
+                  <pic:spPr>
+                    <a:xfrm>
+                      <a:off x="0" y="0"/>
+                      <a:ext cx="5852160" cy="3840480"/>
+                    </a:xfrm>
+                    <a:prstGeom prst="rect"/>
+                  </pic:spPr>
+                </pic:pic>
+              </a:graphicData>
+            </a:graphic>
+          </wp:inline>
+        </w:drawing>
+      </w:r>
+    </w:p>
+    <w:p>
+      <w:pPr>
+        <w:pStyle w:val="Heading2"/>
+        <w:keepNext/>
+      </w:pPr>
+      <w:r>
+        <w:t>ภาพที่ 13: Export CSV จากหน้าพนักงาน</w:t>
+      </w:r>
+    </w:p>
+    <w:p>
+      <w:r>
+        <w:drawing>
+          <wp:inline xmlns:a="http://schemas.openxmlformats.org/drawingml/2006/main" xmlns:pic="http://schemas.openxmlformats.org/drawingml/2006/picture">
+            <wp:extent cx="5852160" cy="3840480"/>
+            <wp:docPr id="13" name="Picture 13"/>
+            <wp:cNvGraphicFramePr>
+              <a:graphicFrameLocks noChangeAspect="1"/>
+            </wp:cNvGraphicFramePr>
+            <a:graphic>
+              <a:graphicData uri="http://schemas.openxmlformats.org/drawingml/2006/picture">
+                <pic:pic>
+                  <pic:nvPicPr>
+                    <pic:cNvPr id="0" name="20260902154721-staff-export.png"/>
+                    <pic:cNvPicPr/>
+                  </pic:nvPicPr>
+                  <pic:blipFill>
+                    <a:blip r:embed="rId22"/>
+                    <a:stretch>
+                      <a:fillRect/>
+                    </a:stretch>
+                  </pic:blipFill>
+                  <pic:spPr>
+                    <a:xfrm>
+                      <a:off x="0" y="0"/>
+                      <a:ext cx="5852160" cy="3840480"/>
+                    </a:xfrm>
+                    <a:prstGeom prst="rect"/>
+                  </pic:spPr>
+                </pic:pic>
+              </a:graphicData>
+            </a:graphic>
+          </wp:inline>
+        </w:drawing>
       </w:r>
     </w:p>
     <w:sectPr>

</xml_diff>

<commit_message>
docs: include screenshots in final report (#35)
Co-authored-by: Krishna Sinlapasa <krishna.sinlapasa@gmail.com>
</commit_message>
<xml_diff>
--- a/docs/Mahosample-final-project-report.docx
+++ b/docs/Mahosample-final-project-report.docx
@@ -27397,6 +27397,617 @@
           <w:rFonts w:ascii="Aptos" w:hAnsi="Aptos" w:eastAsia="Aptos"/>
         </w:rPr>
         <w:t xml:space="preserve"> หลังกรอก tracking</w:t>
+      </w:r>
+    </w:p>
+    <w:p>
+      <w:pPr>
+        <w:sectPr>
+          <w:pgSz w:w="12240" w:h="15840"/>
+          <w:pgMar w:top="1440" w:right="1440" w:bottom="1440" w:left="1440" w:header="708" w:footer="708" w:gutter="0"/>
+          <w:cols w:space="720"/>
+          <w:docGrid w:linePitch="360"/>
+        </w:sectPr>
+      </w:pPr>
+    </w:p>
+    <w:p>
+      <w:pPr>
+        <w:pStyle w:val="Heading1"/>
+      </w:pPr>
+      <w:r>
+        <w:t>ภาคผนวก J: Screen Capture Evidence</w:t>
+      </w:r>
+    </w:p>
+    <w:p>
+      <w:r>
+        <w:rPr>
+          <w:rFonts w:ascii="Aptos" w:hAnsi="Aptos" w:eastAsia="Aptos"/>
+        </w:rPr>
+        <w:t>ภาพหน้าจอชุดนี้จับจาก production URL เพื่อใช้เป็นหลักฐานประกอบการทดสอบ flow หลักของระบบ</w:t>
+      </w:r>
+    </w:p>
+    <w:p>
+      <w:pPr>
+        <w:pStyle w:val="Heading2"/>
+        <w:keepNext/>
+      </w:pPr>
+      <w:r>
+        <w:t>ภาพที่ 1: หน้าแบบฟอร์มลงทะเบียนรับตัวอย่าง มะโฮ</w:t>
+      </w:r>
+    </w:p>
+    <w:p>
+      <w:r>
+        <w:drawing>
+          <wp:inline xmlns:a="http://schemas.openxmlformats.org/drawingml/2006/main" xmlns:pic="http://schemas.openxmlformats.org/drawingml/2006/picture">
+            <wp:extent cx="5852160" cy="3840480"/>
+            <wp:docPr id="1" name="Picture 1"/>
+            <wp:cNvGraphicFramePr>
+              <a:graphicFrameLocks noChangeAspect="1"/>
+            </wp:cNvGraphicFramePr>
+            <a:graphic>
+              <a:graphicData uri="http://schemas.openxmlformats.org/drawingml/2006/picture">
+                <pic:pic>
+                  <pic:nvPicPr>
+                    <pic:cNvPr id="0" name="20260902154721-public-registration-form.png"/>
+                    <pic:cNvPicPr/>
+                  </pic:nvPicPr>
+                  <pic:blipFill>
+                    <a:blip r:embed="rId10"/>
+                    <a:stretch>
+                      <a:fillRect/>
+                    </a:stretch>
+                  </pic:blipFill>
+                  <pic:spPr>
+                    <a:xfrm>
+                      <a:off x="0" y="0"/>
+                      <a:ext cx="5852160" cy="3840480"/>
+                    </a:xfrm>
+                    <a:prstGeom prst="rect"/>
+                  </pic:spPr>
+                </pic:pic>
+              </a:graphicData>
+            </a:graphic>
+          </wp:inline>
+        </w:drawing>
+      </w:r>
+    </w:p>
+    <w:p>
+      <w:pPr>
+        <w:pStyle w:val="Heading2"/>
+        <w:keepNext/>
+      </w:pPr>
+      <w:r>
+        <w:t>ภาพที่ 2: Validation เมื่อไม่กรอกช่องทางติดต่อ</w:t>
+      </w:r>
+    </w:p>
+    <w:p>
+      <w:r>
+        <w:drawing>
+          <wp:inline xmlns:a="http://schemas.openxmlformats.org/drawingml/2006/main" xmlns:pic="http://schemas.openxmlformats.org/drawingml/2006/picture">
+            <wp:extent cx="5852160" cy="3840480"/>
+            <wp:docPr id="2" name="Picture 2"/>
+            <wp:cNvGraphicFramePr>
+              <a:graphicFrameLocks noChangeAspect="1"/>
+            </wp:cNvGraphicFramePr>
+            <a:graphic>
+              <a:graphicData uri="http://schemas.openxmlformats.org/drawingml/2006/picture">
+                <pic:pic>
+                  <pic:nvPicPr>
+                    <pic:cNvPr id="0" name="20260902154721-public-contact-validation.png"/>
+                    <pic:cNvPicPr/>
+                  </pic:nvPicPr>
+                  <pic:blipFill>
+                    <a:blip r:embed="rId11"/>
+                    <a:stretch>
+                      <a:fillRect/>
+                    </a:stretch>
+                  </pic:blipFill>
+                  <pic:spPr>
+                    <a:xfrm>
+                      <a:off x="0" y="0"/>
+                      <a:ext cx="5852160" cy="3840480"/>
+                    </a:xfrm>
+                    <a:prstGeom prst="rect"/>
+                  </pic:spPr>
+                </pic:pic>
+              </a:graphicData>
+            </a:graphic>
+          </wp:inline>
+        </w:drawing>
+      </w:r>
+    </w:p>
+    <w:p>
+      <w:pPr>
+        <w:pStyle w:val="Heading2"/>
+        <w:keepNext/>
+      </w:pPr>
+      <w:r>
+        <w:t>ภาพที่ 3: Success card หลังส่งฟอร์ม พร้อมเลขรายการภายใน</w:t>
+      </w:r>
+    </w:p>
+    <w:p>
+      <w:r>
+        <w:drawing>
+          <wp:inline xmlns:a="http://schemas.openxmlformats.org/drawingml/2006/main" xmlns:pic="http://schemas.openxmlformats.org/drawingml/2006/picture">
+            <wp:extent cx="5852160" cy="3840480"/>
+            <wp:docPr id="3" name="Picture 3"/>
+            <wp:cNvGraphicFramePr>
+              <a:graphicFrameLocks noChangeAspect="1"/>
+            </wp:cNvGraphicFramePr>
+            <a:graphic>
+              <a:graphicData uri="http://schemas.openxmlformats.org/drawingml/2006/picture">
+                <pic:pic>
+                  <pic:nvPicPr>
+                    <pic:cNvPr id="0" name="20260902154721-public-success-card.png"/>
+                    <pic:cNvPicPr/>
+                  </pic:nvPicPr>
+                  <pic:blipFill>
+                    <a:blip r:embed="rId12"/>
+                    <a:stretch>
+                      <a:fillRect/>
+                    </a:stretch>
+                  </pic:blipFill>
+                  <pic:spPr>
+                    <a:xfrm>
+                      <a:off x="0" y="0"/>
+                      <a:ext cx="5852160" cy="3840480"/>
+                    </a:xfrm>
+                    <a:prstGeom prst="rect"/>
+                  </pic:spPr>
+                </pic:pic>
+              </a:graphicData>
+            </a:graphic>
+          </wp:inline>
+        </w:drawing>
+      </w:r>
+    </w:p>
+    <w:p>
+      <w:pPr>
+        <w:pStyle w:val="Heading2"/>
+        <w:keepNext/>
+      </w:pPr>
+      <w:r>
+        <w:t>ภาพที่ 4: หน้าเช็คสถานะพบเลข tracking และ Tracking URL</w:t>
+      </w:r>
+    </w:p>
+    <w:p>
+      <w:r>
+        <w:drawing>
+          <wp:inline xmlns:a="http://schemas.openxmlformats.org/drawingml/2006/main" xmlns:pic="http://schemas.openxmlformats.org/drawingml/2006/picture">
+            <wp:extent cx="5852160" cy="3840480"/>
+            <wp:docPr id="4" name="Picture 4"/>
+            <wp:cNvGraphicFramePr>
+              <a:graphicFrameLocks noChangeAspect="1"/>
+            </wp:cNvGraphicFramePr>
+            <a:graphic>
+              <a:graphicData uri="http://schemas.openxmlformats.org/drawingml/2006/picture">
+                <pic:pic>
+                  <pic:nvPicPr>
+                    <pic:cNvPr id="0" name="20260902154721-tracking-found.png"/>
+                    <pic:cNvPicPr/>
+                  </pic:nvPicPr>
+                  <pic:blipFill>
+                    <a:blip r:embed="rId13"/>
+                    <a:stretch>
+                      <a:fillRect/>
+                    </a:stretch>
+                  </pic:blipFill>
+                  <pic:spPr>
+                    <a:xfrm>
+                      <a:off x="0" y="0"/>
+                      <a:ext cx="5852160" cy="3840480"/>
+                    </a:xfrm>
+                    <a:prstGeom prst="rect"/>
+                  </pic:spPr>
+                </pic:pic>
+              </a:graphicData>
+            </a:graphic>
+          </wp:inline>
+        </w:drawing>
+      </w:r>
+    </w:p>
+    <w:p>
+      <w:pPr>
+        <w:pStyle w:val="Heading2"/>
+        <w:keepNext/>
+      </w:pPr>
+      <w:r>
+        <w:t>ภาพที่ 5: หน้าเช็คสถานะเมื่อไม่พบเลข tracking</w:t>
+      </w:r>
+    </w:p>
+    <w:p>
+      <w:r>
+        <w:drawing>
+          <wp:inline xmlns:a="http://schemas.openxmlformats.org/drawingml/2006/main" xmlns:pic="http://schemas.openxmlformats.org/drawingml/2006/picture">
+            <wp:extent cx="5852160" cy="3840480"/>
+            <wp:docPr id="5" name="Picture 5"/>
+            <wp:cNvGraphicFramePr>
+              <a:graphicFrameLocks noChangeAspect="1"/>
+            </wp:cNvGraphicFramePr>
+            <a:graphic>
+              <a:graphicData uri="http://schemas.openxmlformats.org/drawingml/2006/picture">
+                <pic:pic>
+                  <pic:nvPicPr>
+                    <pic:cNvPr id="0" name="20260902154721-tracking-not-found.png"/>
+                    <pic:cNvPicPr/>
+                  </pic:nvPicPr>
+                  <pic:blipFill>
+                    <a:blip r:embed="rId14"/>
+                    <a:stretch>
+                      <a:fillRect/>
+                    </a:stretch>
+                  </pic:blipFill>
+                  <pic:spPr>
+                    <a:xfrm>
+                      <a:off x="0" y="0"/>
+                      <a:ext cx="5852160" cy="3840480"/>
+                    </a:xfrm>
+                    <a:prstGeom prst="rect"/>
+                  </pic:spPr>
+                </pic:pic>
+              </a:graphicData>
+            </a:graphic>
+          </wp:inline>
+        </w:drawing>
+      </w:r>
+    </w:p>
+    <w:p>
+      <w:pPr>
+        <w:pStyle w:val="Heading2"/>
+        <w:keepNext/>
+      </w:pPr>
+      <w:r>
+        <w:t>ภาพที่ 6: Dashboard พนักงานหลัง login</w:t>
+      </w:r>
+    </w:p>
+    <w:p>
+      <w:r>
+        <w:drawing>
+          <wp:inline xmlns:a="http://schemas.openxmlformats.org/drawingml/2006/main" xmlns:pic="http://schemas.openxmlformats.org/drawingml/2006/picture">
+            <wp:extent cx="5852160" cy="3840480"/>
+            <wp:docPr id="6" name="Picture 6"/>
+            <wp:cNvGraphicFramePr>
+              <a:graphicFrameLocks noChangeAspect="1"/>
+            </wp:cNvGraphicFramePr>
+            <a:graphic>
+              <a:graphicData uri="http://schemas.openxmlformats.org/drawingml/2006/picture">
+                <pic:pic>
+                  <pic:nvPicPr>
+                    <pic:cNvPr id="0" name="20260902154721-staff-dashboard.png"/>
+                    <pic:cNvPicPr/>
+                  </pic:nvPicPr>
+                  <pic:blipFill>
+                    <a:blip r:embed="rId15"/>
+                    <a:stretch>
+                      <a:fillRect/>
+                    </a:stretch>
+                  </pic:blipFill>
+                  <pic:spPr>
+                    <a:xfrm>
+                      <a:off x="0" y="0"/>
+                      <a:ext cx="5852160" cy="3840480"/>
+                    </a:xfrm>
+                    <a:prstGeom prst="rect"/>
+                  </pic:spPr>
+                </pic:pic>
+              </a:graphicData>
+            </a:graphic>
+          </wp:inline>
+        </w:drawing>
+      </w:r>
+    </w:p>
+    <w:p>
+      <w:pPr>
+        <w:pStyle w:val="Heading2"/>
+        <w:keepNext/>
+      </w:pPr>
+      <w:r>
+        <w:t>ภาพที่ 7: หน้าตารางข้อมูลเต็ม แสดง column ข้อมูลทั้งหมด</w:t>
+      </w:r>
+    </w:p>
+    <w:p>
+      <w:r>
+        <w:drawing>
+          <wp:inline xmlns:a="http://schemas.openxmlformats.org/drawingml/2006/main" xmlns:pic="http://schemas.openxmlformats.org/drawingml/2006/picture">
+            <wp:extent cx="5852160" cy="3840480"/>
+            <wp:docPr id="7" name="Picture 7"/>
+            <wp:cNvGraphicFramePr>
+              <a:graphicFrameLocks noChangeAspect="1"/>
+            </wp:cNvGraphicFramePr>
+            <a:graphic>
+              <a:graphicData uri="http://schemas.openxmlformats.org/drawingml/2006/picture">
+                <pic:pic>
+                  <pic:nvPicPr>
+                    <pic:cNvPr id="0" name="20260902154721-staff-full-table.png"/>
+                    <pic:cNvPicPr/>
+                  </pic:nvPicPr>
+                  <pic:blipFill>
+                    <a:blip r:embed="rId16"/>
+                    <a:stretch>
+                      <a:fillRect/>
+                    </a:stretch>
+                  </pic:blipFill>
+                  <pic:spPr>
+                    <a:xfrm>
+                      <a:off x="0" y="0"/>
+                      <a:ext cx="5852160" cy="3840480"/>
+                    </a:xfrm>
+                    <a:prstGeom prst="rect"/>
+                  </pic:spPr>
+                </pic:pic>
+              </a:graphicData>
+            </a:graphic>
+          </wp:inline>
+        </w:drawing>
+      </w:r>
+    </w:p>
+    <w:p>
+      <w:pPr>
+        <w:pStyle w:val="Heading2"/>
+        <w:keepNext/>
+      </w:pPr>
+      <w:r>
+        <w:t>ภาพที่ 8: Filter header ตารางด้วยจังหวัด</w:t>
+      </w:r>
+    </w:p>
+    <w:p>
+      <w:r>
+        <w:drawing>
+          <wp:inline xmlns:a="http://schemas.openxmlformats.org/drawingml/2006/main" xmlns:pic="http://schemas.openxmlformats.org/drawingml/2006/picture">
+            <wp:extent cx="5852160" cy="3840480"/>
+            <wp:docPr id="8" name="Picture 8"/>
+            <wp:cNvGraphicFramePr>
+              <a:graphicFrameLocks noChangeAspect="1"/>
+            </wp:cNvGraphicFramePr>
+            <a:graphic>
+              <a:graphicData uri="http://schemas.openxmlformats.org/drawingml/2006/picture">
+                <pic:pic>
+                  <pic:nvPicPr>
+                    <pic:cNvPr id="0" name="20260902154721-staff-filter-province.png"/>
+                    <pic:cNvPicPr/>
+                  </pic:nvPicPr>
+                  <pic:blipFill>
+                    <a:blip r:embed="rId17"/>
+                    <a:stretch>
+                      <a:fillRect/>
+                    </a:stretch>
+                  </pic:blipFill>
+                  <pic:spPr>
+                    <a:xfrm>
+                      <a:off x="0" y="0"/>
+                      <a:ext cx="5852160" cy="3840480"/>
+                    </a:xfrm>
+                    <a:prstGeom prst="rect"/>
+                  </pic:spPr>
+                </pic:pic>
+              </a:graphicData>
+            </a:graphic>
+          </wp:inline>
+        </w:drawing>
+      </w:r>
+    </w:p>
+    <w:p>
+      <w:pPr>
+        <w:pStyle w:val="Heading2"/>
+        <w:keepNext/>
+      </w:pPr>
+      <w:r>
+        <w:t>ภาพที่ 9: Filter วันที่ส่งและวันที่ลงทะเบียนแบบช่วงเวลา</w:t>
+      </w:r>
+    </w:p>
+    <w:p>
+      <w:r>
+        <w:drawing>
+          <wp:inline xmlns:a="http://schemas.openxmlformats.org/drawingml/2006/main" xmlns:pic="http://schemas.openxmlformats.org/drawingml/2006/picture">
+            <wp:extent cx="5852160" cy="3840480"/>
+            <wp:docPr id="9" name="Picture 9"/>
+            <wp:cNvGraphicFramePr>
+              <a:graphicFrameLocks noChangeAspect="1"/>
+            </wp:cNvGraphicFramePr>
+            <a:graphic>
+              <a:graphicData uri="http://schemas.openxmlformats.org/drawingml/2006/picture">
+                <pic:pic>
+                  <pic:nvPicPr>
+                    <pic:cNvPr id="0" name="20260902154721-staff-date-range-filter.png"/>
+                    <pic:cNvPicPr/>
+                  </pic:nvPicPr>
+                  <pic:blipFill>
+                    <a:blip r:embed="rId18"/>
+                    <a:stretch>
+                      <a:fillRect/>
+                    </a:stretch>
+                  </pic:blipFill>
+                  <pic:spPr>
+                    <a:xfrm>
+                      <a:off x="0" y="0"/>
+                      <a:ext cx="5852160" cy="3840480"/>
+                    </a:xfrm>
+                    <a:prstGeom prst="rect"/>
+                  </pic:spPr>
+                </pic:pic>
+              </a:graphicData>
+            </a:graphic>
+          </wp:inline>
+        </w:drawing>
+      </w:r>
+    </w:p>
+    <w:p>
+      <w:pPr>
+        <w:pStyle w:val="Heading2"/>
+        <w:keepNext/>
+      </w:pPr>
+      <w:r>
+        <w:t>ภาพที่ 10: Sorting จาก header ตาราง</w:t>
+      </w:r>
+    </w:p>
+    <w:p>
+      <w:r>
+        <w:drawing>
+          <wp:inline xmlns:a="http://schemas.openxmlformats.org/drawingml/2006/main" xmlns:pic="http://schemas.openxmlformats.org/drawingml/2006/picture">
+            <wp:extent cx="5852160" cy="3840480"/>
+            <wp:docPr id="10" name="Picture 10"/>
+            <wp:cNvGraphicFramePr>
+              <a:graphicFrameLocks noChangeAspect="1"/>
+            </wp:cNvGraphicFramePr>
+            <a:graphic>
+              <a:graphicData uri="http://schemas.openxmlformats.org/drawingml/2006/picture">
+                <pic:pic>
+                  <pic:nvPicPr>
+                    <pic:cNvPr id="0" name="20260902154721-staff-sorting.png"/>
+                    <pic:cNvPicPr/>
+                  </pic:nvPicPr>
+                  <pic:blipFill>
+                    <a:blip r:embed="rId19"/>
+                    <a:stretch>
+                      <a:fillRect/>
+                    </a:stretch>
+                  </pic:blipFill>
+                  <pic:spPr>
+                    <a:xfrm>
+                      <a:off x="0" y="0"/>
+                      <a:ext cx="5852160" cy="3840480"/>
+                    </a:xfrm>
+                    <a:prstGeom prst="rect"/>
+                  </pic:spPr>
+                </pic:pic>
+              </a:graphicData>
+            </a:graphic>
+          </wp:inline>
+        </w:drawing>
+      </w:r>
+    </w:p>
+    <w:p>
+      <w:pPr>
+        <w:pStyle w:val="Heading2"/>
+        <w:keepNext/>
+      </w:pPr>
+      <w:r>
+        <w:t>ภาพที่ 11: Drawer รายละเอียด พร้อมบันทึกคำขอและอัปเดตขนส่ง</w:t>
+      </w:r>
+    </w:p>
+    <w:p>
+      <w:r>
+        <w:drawing>
+          <wp:inline xmlns:a="http://schemas.openxmlformats.org/drawingml/2006/main" xmlns:pic="http://schemas.openxmlformats.org/drawingml/2006/picture">
+            <wp:extent cx="5852160" cy="3840480"/>
+            <wp:docPr id="11" name="Picture 11"/>
+            <wp:cNvGraphicFramePr>
+              <a:graphicFrameLocks noChangeAspect="1"/>
+            </wp:cNvGraphicFramePr>
+            <a:graphic>
+              <a:graphicData uri="http://schemas.openxmlformats.org/drawingml/2006/picture">
+                <pic:pic>
+                  <pic:nvPicPr>
+                    <pic:cNvPr id="0" name="20260902154721-staff-detail-drawer.png"/>
+                    <pic:cNvPicPr/>
+                  </pic:nvPicPr>
+                  <pic:blipFill>
+                    <a:blip r:embed="rId20"/>
+                    <a:stretch>
+                      <a:fillRect/>
+                    </a:stretch>
+                  </pic:blipFill>
+                  <pic:spPr>
+                    <a:xfrm>
+                      <a:off x="0" y="0"/>
+                      <a:ext cx="5852160" cy="3840480"/>
+                    </a:xfrm>
+                    <a:prstGeom prst="rect"/>
+                  </pic:spPr>
+                </pic:pic>
+              </a:graphicData>
+            </a:graphic>
+          </wp:inline>
+        </w:drawing>
+      </w:r>
+    </w:p>
+    <w:p>
+      <w:pPr>
+        <w:pStyle w:val="Heading2"/>
+        <w:keepNext/>
+      </w:pPr>
+      <w:r>
+        <w:t>ภาพที่ 12: Tracking URL แสดงเป็น link คลิกได้</w:t>
+      </w:r>
+    </w:p>
+    <w:p>
+      <w:r>
+        <w:drawing>
+          <wp:inline xmlns:a="http://schemas.openxmlformats.org/drawingml/2006/main" xmlns:pic="http://schemas.openxmlformats.org/drawingml/2006/picture">
+            <wp:extent cx="5852160" cy="3840480"/>
+            <wp:docPr id="12" name="Picture 12"/>
+            <wp:cNvGraphicFramePr>
+              <a:graphicFrameLocks noChangeAspect="1"/>
+            </wp:cNvGraphicFramePr>
+            <a:graphic>
+              <a:graphicData uri="http://schemas.openxmlformats.org/drawingml/2006/picture">
+                <pic:pic>
+                  <pic:nvPicPr>
+                    <pic:cNvPr id="0" name="20260902154721-staff-tracking-url-link.png"/>
+                    <pic:cNvPicPr/>
+                  </pic:nvPicPr>
+                  <pic:blipFill>
+                    <a:blip r:embed="rId21"/>
+                    <a:stretch>
+                      <a:fillRect/>
+                    </a:stretch>
+                  </pic:blipFill>
+                  <pic:spPr>
+                    <a:xfrm>
+                      <a:off x="0" y="0"/>
+                      <a:ext cx="5852160" cy="3840480"/>
+                    </a:xfrm>
+                    <a:prstGeom prst="rect"/>
+                  </pic:spPr>
+                </pic:pic>
+              </a:graphicData>
+            </a:graphic>
+          </wp:inline>
+        </w:drawing>
+      </w:r>
+    </w:p>
+    <w:p>
+      <w:pPr>
+        <w:pStyle w:val="Heading2"/>
+        <w:keepNext/>
+      </w:pPr>
+      <w:r>
+        <w:t>ภาพที่ 13: Export CSV จากหน้าพนักงาน</w:t>
+      </w:r>
+    </w:p>
+    <w:p>
+      <w:r>
+        <w:drawing>
+          <wp:inline xmlns:a="http://schemas.openxmlformats.org/drawingml/2006/main" xmlns:pic="http://schemas.openxmlformats.org/drawingml/2006/picture">
+            <wp:extent cx="5852160" cy="3840480"/>
+            <wp:docPr id="13" name="Picture 13"/>
+            <wp:cNvGraphicFramePr>
+              <a:graphicFrameLocks noChangeAspect="1"/>
+            </wp:cNvGraphicFramePr>
+            <a:graphic>
+              <a:graphicData uri="http://schemas.openxmlformats.org/drawingml/2006/picture">
+                <pic:pic>
+                  <pic:nvPicPr>
+                    <pic:cNvPr id="0" name="20260902154721-staff-export.png"/>
+                    <pic:cNvPicPr/>
+                  </pic:nvPicPr>
+                  <pic:blipFill>
+                    <a:blip r:embed="rId22"/>
+                    <a:stretch>
+                      <a:fillRect/>
+                    </a:stretch>
+                  </pic:blipFill>
+                  <pic:spPr>
+                    <a:xfrm>
+                      <a:off x="0" y="0"/>
+                      <a:ext cx="5852160" cy="3840480"/>
+                    </a:xfrm>
+                    <a:prstGeom prst="rect"/>
+                  </pic:spPr>
+                </pic:pic>
+              </a:graphicData>
+            </a:graphic>
+          </wp:inline>
+        </w:drawing>
       </w:r>
     </w:p>
     <w:sectPr>

</xml_diff>